<commit_message>
Whole Exome & Mitochondrial: drop the parental sequencing recommendation
Co-Authored-By: Claude Opus 5.5 <noreply@anthropic.com>
</commit_message>
<xml_diff>
--- a/app/templates/whole_exome_mito.docx
+++ b/app/templates/whole_exome_mito.docx
@@ -2591,33 +2591,6 @@
         </w:rPr>
         <w:lastRenderedPageBreak/>
         <w:t>Recommendations</w:t>
-      </w:r>
-    </w:p>
-    <w:p>
-      <w:pPr>
-        <w:pStyle w:val="BodyText"/>
-        <w:numPr>
-          <w:ilvl w:val="0"/>
-          <w:numId w:val="2"/>
-        </w:numPr>
-        <w:spacing w:before="0" w:line="319" w:lineRule="auto"/>
-        <w:ind w:left="1077" w:hanging="357"/>
-        <w:jc w:val="both"/>
-        <w:rPr>
-          <w:color w:val="242629"/>
-          <w:w w:val="105"/>
-          <w:sz w:val="18"/>
-          <w:szCs w:val="18"/>
-        </w:rPr>
-      </w:pPr>
-      <w:r>
-        <w:rPr>
-          <w:color w:val="242629"/>
-          <w:w w:val="105"/>
-          <w:sz w:val="18"/>
-          <w:szCs w:val="18"/>
-        </w:rPr>
-        <w:t>Sequencing the variant(s) in the parents and the other affected and unaffected members of the family is recommended to confirm the significance.</w:t>
       </w:r>
     </w:p>
     <w:p>

</xml_diff>